<commit_message>
AI voices report: add measured Monchau broad-keyword tech share (295 of 1,051, 28%)
Co-Authored-By: Claude Opus 5.5 <noreply@anthropic.com>
Claude-Session: https://claude.ai/code/session_014bN7rQcP2nbYZw3SVHbi7t
</commit_message>
<xml_diff>
--- a/reports/ai-voices-linkedin-2026-10-28/AI_Voices_LinkedIn_Analysis.docx
+++ b/reports/ai-voices-linkedin-2026-10-28/AI_Voices_LinkedIn_Analysis.docx
@@ -243,6 +243,36 @@
           <w:szCs w:val="20"/>
         </w:rPr>
         <w:t xml:space="preserve">by the same keyword rule used for Monchau, Mollick posts 8.54 tech/AI posts a week, Miller 3.69, Hoffman 1.69, Ng 1.0, Gates 0.92, Nadella 0.69 and Srinivas 0.15. As a share of their posts: Ng 93%, Miller 91%, Hoffman 71%, Mollick 56%, Nadella 38%, Gates 18%, Srinivas 15%, against Monchau's 26%.</w:t>
+      </w:r>
+    </w:p>
+    <w:p>
+      <w:pPr>
+        <w:pStyle w:val="ListParagraph"/>
+        <w:numPr>
+          <w:ilvl w:val="0"/>
+          <w:numId w:val="2"/>
+        </w:numPr>
+        <w:spacing w:after="80" w:line="276"/>
+      </w:pPr>
+      <w:r>
+        <w:rPr>
+          <w:rFonts w:ascii="Calibri" w:cs="Calibri" w:eastAsia="Calibri" w:hAnsi="Calibri"/>
+          <w:b/>
+          <w:bCs/>
+          <w:color w:val="1C1D1F"/>
+          <w:sz w:val="20"/>
+          <w:szCs w:val="20"/>
+        </w:rPr>
+        <w:t xml:space="preserve">Monchau barely moves under the broader rule. </w:t>
+      </w:r>
+      <w:r>
+        <w:rPr>
+          <w:rFonts w:ascii="Calibri" w:cs="Calibri" w:eastAsia="Calibri" w:hAnsi="Calibri"/>
+          <w:color w:val="1C1D1F"/>
+          <w:sz w:val="20"/>
+          <w:szCs w:val="20"/>
+        </w:rPr>
+        <w:t xml:space="preserve">Measured with the same broad keyword set, 295 of his 1,051 posts match (28%, against 26% narrow): almost every "model", "GPT" or "compute" post of his already says "AI" or "tech". The big jumps are confined to product-led writers such as Nadella (38% → 88%) and Srinivas (15% → 85%).</w:t>
       </w:r>
     </w:p>
     <w:p>
@@ -1313,7 +1343,7 @@
             <w:pPr>
               <w:spacing w:after="0" w:line="252"/>
             </w:pPr>
-            <w:hyperlink w:history="1" r:id="rId4icoopvmm17ourjrhszcw">
+            <w:hyperlink w:history="1" r:id="rIdfegtgszgqxp2bxv7hhtcj">
               <w:r>
                 <w:rPr>
                   <w:rStyle w:val="Hyperlink"/>
@@ -1639,7 +1669,7 @@
             <w:pPr>
               <w:spacing w:after="0" w:line="252"/>
             </w:pPr>
-            <w:hyperlink w:history="1" r:id="rIdbkrgm6umqvwe6i5yb1i79">
+            <w:hyperlink w:history="1" r:id="rIdwxkf1fazlqqo7tpnyecf6">
               <w:r>
                 <w:rPr>
                   <w:rStyle w:val="Hyperlink"/>
@@ -1965,7 +1995,7 @@
             <w:pPr>
               <w:spacing w:after="0" w:line="252"/>
             </w:pPr>
-            <w:hyperlink w:history="1" r:id="rIdjxxpypls2lk-fbewn2zm4">
+            <w:hyperlink w:history="1" r:id="rIdhpgomzpx_haka-xbgr1by">
               <w:r>
                 <w:rPr>
                   <w:rStyle w:val="Hyperlink"/>
@@ -2291,7 +2321,7 @@
             <w:pPr>
               <w:spacing w:after="0" w:line="252"/>
             </w:pPr>
-            <w:hyperlink w:history="1" r:id="rIdsghjktbg8zbfgxccr0dzj">
+            <w:hyperlink w:history="1" r:id="rIdulx7l13mvwwnjkxzqonho">
               <w:r>
                 <w:rPr>
                   <w:rStyle w:val="Hyperlink"/>
@@ -2617,7 +2647,7 @@
             <w:pPr>
               <w:spacing w:after="0" w:line="252"/>
             </w:pPr>
-            <w:hyperlink w:history="1" r:id="rIdnewgukygmmyxm2nbrtaeu">
+            <w:hyperlink w:history="1" r:id="rId4zbbhqgyt1mp4b0hkzfv2">
               <w:r>
                 <w:rPr>
                   <w:rStyle w:val="Hyperlink"/>
@@ -2943,7 +2973,7 @@
             <w:pPr>
               <w:spacing w:after="0" w:line="252"/>
             </w:pPr>
-            <w:hyperlink w:history="1" r:id="rIdznbx1dmyz6nu_5v13kbko">
+            <w:hyperlink w:history="1" r:id="rId8otjv__mfa57_bmdx3ldz">
               <w:r>
                 <w:rPr>
                   <w:rStyle w:val="Hyperlink"/>
@@ -3269,7 +3299,7 @@
             <w:pPr>
               <w:spacing w:after="0" w:line="252"/>
             </w:pPr>
-            <w:hyperlink w:history="1" r:id="rIdcjxy8ukxfcrwz7zy6iwzy">
+            <w:hyperlink w:history="1" r:id="rId9_xbmjduvo34dgzpcuzwl">
               <w:r>
                 <w:rPr>
                   <w:rStyle w:val="Hyperlink"/>
@@ -3297,7 +3327,7 @@
           <w:sz w:val="16"/>
           <w:szCs w:val="16"/>
         </w:rPr>
-        <w:t xml:space="preserve">Monchau benchmark: 1,051 posts, 80.8 a week, 271 tech (26%), 86% credit a source.</w:t>
+        <w:t xml:space="preserve">Monchau benchmark: 1,051 posts, 80.8 a week, 271 tech (26%; 295 or 28% with the broad keywords), 86% credit a source.</w:t>
       </w:r>
     </w:p>
     <w:p>
@@ -7297,7 +7327,7 @@
             <w:pPr>
               <w:spacing w:after="0" w:line="252"/>
             </w:pPr>
-            <w:hyperlink w:history="1" r:id="rIdfiarcuozo0tcgqoruzu6h">
+            <w:hyperlink w:history="1" r:id="rIdnvv51_cuipvanymaorlvg">
               <w:r>
                 <w:rPr>
                   <w:rStyle w:val="Hyperlink"/>
@@ -7524,7 +7554,7 @@
             <w:pPr>
               <w:spacing w:after="0" w:line="252"/>
             </w:pPr>
-            <w:hyperlink w:history="1" r:id="rIdtx-7c1aazfblrewoota1r">
+            <w:hyperlink w:history="1" r:id="rIdhw2in-87owelhoxardzib">
               <w:r>
                 <w:rPr>
                   <w:rStyle w:val="Hyperlink"/>
@@ -7751,7 +7781,7 @@
             <w:pPr>
               <w:spacing w:after="0" w:line="252"/>
             </w:pPr>
-            <w:hyperlink w:history="1" r:id="rIdnmny2wevmh59xrtcaxwh6">
+            <w:hyperlink w:history="1" r:id="rId_9nq4afcqfg8rmfolkcob">
               <w:r>
                 <w:rPr>
                   <w:rStyle w:val="Hyperlink"/>
@@ -8330,7 +8360,7 @@
             <w:pPr>
               <w:spacing w:after="0" w:line="252"/>
             </w:pPr>
-            <w:hyperlink w:history="1" r:id="rId6b2x-qzk1iyczdlk_fki-">
+            <w:hyperlink w:history="1" r:id="rId6kbzcn351cqdmxj4czazv">
               <w:r>
                 <w:rPr>
                   <w:rStyle w:val="Hyperlink"/>
@@ -8557,7 +8587,7 @@
             <w:pPr>
               <w:spacing w:after="0" w:line="252"/>
             </w:pPr>
-            <w:hyperlink w:history="1" r:id="rIdjgkecoqjur85wtiildafs">
+            <w:hyperlink w:history="1" r:id="rIdpdyef8-a_dpe6v8vfnc0g">
               <w:r>
                 <w:rPr>
                   <w:rStyle w:val="Hyperlink"/>
@@ -8784,7 +8814,7 @@
             <w:pPr>
               <w:spacing w:after="0" w:line="252"/>
             </w:pPr>
-            <w:hyperlink w:history="1" r:id="rIdtpwqyfjhcexz4ns7bfmwx">
+            <w:hyperlink w:history="1" r:id="rIdtkayiqhlebozxtqqgu6zz">
               <w:r>
                 <w:rPr>
                   <w:rStyle w:val="Hyperlink"/>
@@ -9363,7 +9393,7 @@
             <w:pPr>
               <w:spacing w:after="0" w:line="252"/>
             </w:pPr>
-            <w:hyperlink w:history="1" r:id="rIdi7wm_kwbxwy2vo_1iglre">
+            <w:hyperlink w:history="1" r:id="rId0ci1ncytvysgq0z_rlani">
               <w:r>
                 <w:rPr>
                   <w:rStyle w:val="Hyperlink"/>
@@ -9590,7 +9620,7 @@
             <w:pPr>
               <w:spacing w:after="0" w:line="252"/>
             </w:pPr>
-            <w:hyperlink w:history="1" r:id="rId41hl7-0wfpkf0y1vbfjol">
+            <w:hyperlink w:history="1" r:id="rIdqgnsbui_dnmcqneiovywi">
               <w:r>
                 <w:rPr>
                   <w:rStyle w:val="Hyperlink"/>
@@ -9817,7 +9847,7 @@
             <w:pPr>
               <w:spacing w:after="0" w:line="252"/>
             </w:pPr>
-            <w:hyperlink w:history="1" r:id="rIduokx4up3jroyobif3xadb">
+            <w:hyperlink w:history="1" r:id="rIditwkwkc6ykjmq9qkugf5e">
               <w:r>
                 <w:rPr>
                   <w:rStyle w:val="Hyperlink"/>
@@ -10396,7 +10426,7 @@
             <w:pPr>
               <w:spacing w:after="0" w:line="252"/>
             </w:pPr>
-            <w:hyperlink w:history="1" r:id="rIdxcnb6fibc566ywc-p1zvn">
+            <w:hyperlink w:history="1" r:id="rIdiblwzycjizceodb7x-ftn">
               <w:r>
                 <w:rPr>
                   <w:rStyle w:val="Hyperlink"/>
@@ -10623,7 +10653,7 @@
             <w:pPr>
               <w:spacing w:after="0" w:line="252"/>
             </w:pPr>
-            <w:hyperlink w:history="1" r:id="rIdo6qz_s2rez51meecpzp3d">
+            <w:hyperlink w:history="1" r:id="rIdzbs94dtbt_1bdfxzvdt1w">
               <w:r>
                 <w:rPr>
                   <w:rStyle w:val="Hyperlink"/>
@@ -10850,7 +10880,7 @@
             <w:pPr>
               <w:spacing w:after="0" w:line="252"/>
             </w:pPr>
-            <w:hyperlink w:history="1" r:id="rIdwexsfrfqgu_ul8s_batqm">
+            <w:hyperlink w:history="1" r:id="rId8yfzawb7eopf84xwf6osb">
               <w:r>
                 <w:rPr>
                   <w:rStyle w:val="Hyperlink"/>
@@ -11429,7 +11459,7 @@
             <w:pPr>
               <w:spacing w:after="0" w:line="252"/>
             </w:pPr>
-            <w:hyperlink w:history="1" r:id="rIdorgcspls9h9zwcnkpwgrv">
+            <w:hyperlink w:history="1" r:id="rIddcmoh5it62a-xsirx0ocx">
               <w:r>
                 <w:rPr>
                   <w:rStyle w:val="Hyperlink"/>
@@ -11656,7 +11686,7 @@
             <w:pPr>
               <w:spacing w:after="0" w:line="252"/>
             </w:pPr>
-            <w:hyperlink w:history="1" r:id="rIdqq0z6fqy1af2rynx5odgr">
+            <w:hyperlink w:history="1" r:id="rIdp5a3qsve-tibs1yia9eik">
               <w:r>
                 <w:rPr>
                   <w:rStyle w:val="Hyperlink"/>
@@ -11883,7 +11913,7 @@
             <w:pPr>
               <w:spacing w:after="0" w:line="252"/>
             </w:pPr>
-            <w:hyperlink w:history="1" r:id="rIdcyv6iolpndfcvnvfgccqt">
+            <w:hyperlink w:history="1" r:id="rIdbjk1n4qqkxzfxek6a09jt">
               <w:r>
                 <w:rPr>
                   <w:rStyle w:val="Hyperlink"/>
@@ -12462,7 +12492,7 @@
             <w:pPr>
               <w:spacing w:after="0" w:line="252"/>
             </w:pPr>
-            <w:hyperlink w:history="1" r:id="rId-fks4-bainehottm-v0dt">
+            <w:hyperlink w:history="1" r:id="rIdl6agkm9qpxc92l8v6p1av">
               <w:r>
                 <w:rPr>
                   <w:rStyle w:val="Hyperlink"/>
@@ -12689,7 +12719,7 @@
             <w:pPr>
               <w:spacing w:after="0" w:line="252"/>
             </w:pPr>
-            <w:hyperlink w:history="1" r:id="rIdcsn7eeke9cznyf30x3klj">
+            <w:hyperlink w:history="1" r:id="rIdvo-zxjjg1_pupiokggzua">
               <w:r>
                 <w:rPr>
                   <w:rStyle w:val="Hyperlink"/>
@@ -12916,7 +12946,7 @@
             <w:pPr>
               <w:spacing w:after="0" w:line="252"/>
             </w:pPr>
-            <w:hyperlink w:history="1" r:id="rIdptngs-eg1van21tnckgz4">
+            <w:hyperlink w:history="1" r:id="rIdd5ae48gwcjuls7xl4vbur">
               <w:r>
                 <w:rPr>
                   <w:rStyle w:val="Hyperlink"/>
@@ -13495,7 +13525,7 @@
             <w:pPr>
               <w:spacing w:after="0" w:line="252"/>
             </w:pPr>
-            <w:hyperlink w:history="1" r:id="rIdgnfax9a9h7q1cefvsojy7">
+            <w:hyperlink w:history="1" r:id="rIdxsp4ulhxyvx0avfy5rrjm">
               <w:r>
                 <w:rPr>
                   <w:rStyle w:val="Hyperlink"/>
@@ -13722,7 +13752,7 @@
             <w:pPr>
               <w:spacing w:after="0" w:line="252"/>
             </w:pPr>
-            <w:hyperlink w:history="1" r:id="rIdsokucmtjnmc2c7q-mcnmf">
+            <w:hyperlink w:history="1" r:id="rId4ccdyjly_s0i8u-43qbop">
               <w:r>
                 <w:rPr>
                   <w:rStyle w:val="Hyperlink"/>
@@ -13949,7 +13979,7 @@
             <w:pPr>
               <w:spacing w:after="0" w:line="252"/>
             </w:pPr>
-            <w:hyperlink w:history="1" r:id="rIdcfaeormbbcnkvrywdbie4">
+            <w:hyperlink w:history="1" r:id="rIdcfmv5uryybdpnhs173km4">
               <w:r>
                 <w:rPr>
                   <w:rStyle w:val="Hyperlink"/>
@@ -14599,7 +14629,7 @@
             <w:pPr>
               <w:spacing w:after="0" w:line="252"/>
             </w:pPr>
-            <w:hyperlink w:history="1" r:id="rId2c0pxh5z0yvid1hygpjjp">
+            <w:hyperlink w:history="1" r:id="rIdfwzuogzly7vsz1bi71k-d">
               <w:r>
                 <w:rPr>
                   <w:rStyle w:val="Hyperlink"/>
@@ -14632,7 +14662,7 @@
             <w:pPr>
               <w:spacing w:after="0" w:line="252"/>
             </w:pPr>
-            <w:hyperlink w:history="1" r:id="rIdnpwzwa0y80aloyowfeast">
+            <w:hyperlink w:history="1" r:id="rIdxxsjdin-s3twyfz_oibch">
               <w:r>
                 <w:rPr>
                   <w:rStyle w:val="Hyperlink"/>
@@ -14892,7 +14922,7 @@
             <w:pPr>
               <w:spacing w:after="0" w:line="252"/>
             </w:pPr>
-            <w:hyperlink w:history="1" r:id="rIdgmtyqhlmzynynkkkqo8vc">
+            <w:hyperlink w:history="1" r:id="rIddwwnnodaqcnijvvpwklag">
               <w:r>
                 <w:rPr>
                   <w:rStyle w:val="Hyperlink"/>
@@ -14925,7 +14955,7 @@
             <w:pPr>
               <w:spacing w:after="0" w:line="252"/>
             </w:pPr>
-            <w:hyperlink w:history="1" r:id="rIdkwp6ts9-uezuhzm3fk7wp">
+            <w:hyperlink w:history="1" r:id="rIdrtylywxoqmmq_5ggrxkq1">
               <w:r>
                 <w:rPr>
                   <w:rStyle w:val="Hyperlink"/>
@@ -15185,7 +15215,7 @@
             <w:pPr>
               <w:spacing w:after="0" w:line="252"/>
             </w:pPr>
-            <w:hyperlink w:history="1" r:id="rIdkgliy0s5uizsgpkh3oiqb">
+            <w:hyperlink w:history="1" r:id="rIdtzzkkgisvg4se4c85huma">
               <w:r>
                 <w:rPr>
                   <w:rStyle w:val="Hyperlink"/>
@@ -15218,7 +15248,7 @@
             <w:pPr>
               <w:spacing w:after="0" w:line="252"/>
             </w:pPr>
-            <w:hyperlink w:history="1" r:id="rIdsut2hrmyp4rpwil4wfqyi">
+            <w:hyperlink w:history="1" r:id="rIdzr2exw-2vthmndqlpvods">
               <w:r>
                 <w:rPr>
                   <w:rStyle w:val="Hyperlink"/>
@@ -15478,7 +15508,7 @@
             <w:pPr>
               <w:spacing w:after="0" w:line="252"/>
             </w:pPr>
-            <w:hyperlink w:history="1" r:id="rIdph5mhjvkvupuwlw8xcp4m">
+            <w:hyperlink w:history="1" r:id="rIdjbmbdmjjpqrk-fe1wyuhk">
               <w:r>
                 <w:rPr>
                   <w:rStyle w:val="Hyperlink"/>
@@ -15511,7 +15541,7 @@
             <w:pPr>
               <w:spacing w:after="0" w:line="252"/>
             </w:pPr>
-            <w:hyperlink w:history="1" r:id="rId9xz0udlvw2cjzrmivkufg">
+            <w:hyperlink w:history="1" r:id="rIdmw8ijj-ezjzr102zw42xk">
               <w:r>
                 <w:rPr>
                   <w:rStyle w:val="Hyperlink"/>
@@ -15771,7 +15801,7 @@
             <w:pPr>
               <w:spacing w:after="0" w:line="252"/>
             </w:pPr>
-            <w:hyperlink w:history="1" r:id="rIdjchv0senvlgaqsgclma03">
+            <w:hyperlink w:history="1" r:id="rIdo4i4z7z2ahpeohteglgy9">
               <w:r>
                 <w:rPr>
                   <w:rStyle w:val="Hyperlink"/>
@@ -15804,7 +15834,7 @@
             <w:pPr>
               <w:spacing w:after="0" w:line="252"/>
             </w:pPr>
-            <w:hyperlink w:history="1" r:id="rIdb_temf8y7b5zl9gu4la-j">
+            <w:hyperlink w:history="1" r:id="rIdmuw1sahsgaz7hiy5k5fwe">
               <w:r>
                 <w:rPr>
                   <w:rStyle w:val="Hyperlink"/>
@@ -16064,7 +16094,7 @@
             <w:pPr>
               <w:spacing w:after="0" w:line="252"/>
             </w:pPr>
-            <w:hyperlink w:history="1" r:id="rIdwbyoqblu2ewruyqzje-dg">
+            <w:hyperlink w:history="1" r:id="rIdskgbgn2lufoa8gv2flcqc">
               <w:r>
                 <w:rPr>
                   <w:rStyle w:val="Hyperlink"/>
@@ -16097,7 +16127,7 @@
             <w:pPr>
               <w:spacing w:after="0" w:line="252"/>
             </w:pPr>
-            <w:hyperlink w:history="1" r:id="rIdo8gezgpyz0-nmeginzcg9">
+            <w:hyperlink w:history="1" r:id="rIdmqclcga-ojfpg3p-o2ver">
               <w:r>
                 <w:rPr>
                   <w:rStyle w:val="Hyperlink"/>
@@ -16357,7 +16387,7 @@
             <w:pPr>
               <w:spacing w:after="0" w:line="252"/>
             </w:pPr>
-            <w:hyperlink w:history="1" r:id="rIdvd9jvzffo8hmn790x8hgs">
+            <w:hyperlink w:history="1" r:id="rIdmmhrda8jnttrz885rzmej">
               <w:r>
                 <w:rPr>
                   <w:rStyle w:val="Hyperlink"/>
@@ -16390,7 +16420,7 @@
             <w:pPr>
               <w:spacing w:after="0" w:line="252"/>
             </w:pPr>
-            <w:hyperlink w:history="1" r:id="rIdi0vz8s4cd8ubfqne3rjxz">
+            <w:hyperlink w:history="1" r:id="rIdiaponab2k90dmwtdj0fd3">
               <w:r>
                 <w:rPr>
                   <w:rStyle w:val="Hyperlink"/>
@@ -16650,7 +16680,7 @@
             <w:pPr>
               <w:spacing w:after="0" w:line="252"/>
             </w:pPr>
-            <w:hyperlink w:history="1" r:id="rIdbsidgrarewpwnqymigvzm">
+            <w:hyperlink w:history="1" r:id="rId-wseeyqqtceyiyhezkomt">
               <w:r>
                 <w:rPr>
                   <w:rStyle w:val="Hyperlink"/>
@@ -16683,7 +16713,7 @@
             <w:pPr>
               <w:spacing w:after="0" w:line="252"/>
             </w:pPr>
-            <w:hyperlink w:history="1" r:id="rIdxo3x7ciagrjeltf_fzzqz">
+            <w:hyperlink w:history="1" r:id="rIdcym0ienn07hre2dzxbvzy">
               <w:r>
                 <w:rPr>
                   <w:rStyle w:val="Hyperlink"/>
@@ -16943,7 +16973,7 @@
             <w:pPr>
               <w:spacing w:after="0" w:line="252"/>
             </w:pPr>
-            <w:hyperlink w:history="1" r:id="rIdx-le3ip6v1jfyev7ynhrh">
+            <w:hyperlink w:history="1" r:id="rIdwpotdhj0vuqkdfb1ugibk">
               <w:r>
                 <w:rPr>
                   <w:rStyle w:val="Hyperlink"/>
@@ -16976,7 +17006,7 @@
             <w:pPr>
               <w:spacing w:after="0" w:line="252"/>
             </w:pPr>
-            <w:hyperlink w:history="1" r:id="rIdwbkuqewo6318hb__frjly">
+            <w:hyperlink w:history="1" r:id="rIdgka4jpftbox8nx7ltkma0">
               <w:r>
                 <w:rPr>
                   <w:rStyle w:val="Hyperlink"/>
@@ -17236,7 +17266,7 @@
             <w:pPr>
               <w:spacing w:after="0" w:line="252"/>
             </w:pPr>
-            <w:hyperlink w:history="1" r:id="rIdzacbkkzoyepuwu5bfm6iy">
+            <w:hyperlink w:history="1" r:id="rIdcnpsprrov7abhw0hy3jaz">
               <w:r>
                 <w:rPr>
                   <w:rStyle w:val="Hyperlink"/>
@@ -17269,7 +17299,7 @@
             <w:pPr>
               <w:spacing w:after="0" w:line="252"/>
             </w:pPr>
-            <w:hyperlink w:history="1" r:id="rIdbtxqked43hhiyxemfsper">
+            <w:hyperlink w:history="1" r:id="rId_vbil5jasufwsxh-lnpye">
               <w:r>
                 <w:rPr>
                   <w:rStyle w:val="Hyperlink"/>
@@ -17529,7 +17559,7 @@
             <w:pPr>
               <w:spacing w:after="0" w:line="252"/>
             </w:pPr>
-            <w:hyperlink w:history="1" r:id="rIdd-4a9lcager2tg8sibqih">
+            <w:hyperlink w:history="1" r:id="rIduukhgfd3sl9zswu8azwc5">
               <w:r>
                 <w:rPr>
                   <w:rStyle w:val="Hyperlink"/>
@@ -17562,7 +17592,7 @@
             <w:pPr>
               <w:spacing w:after="0" w:line="252"/>
             </w:pPr>
-            <w:hyperlink w:history="1" r:id="rIdwfojknah8v_xt-zieoqvg">
+            <w:hyperlink w:history="1" r:id="rIdwmnaxaco6tg6zq7yb40le">
               <w:r>
                 <w:rPr>
                   <w:rStyle w:val="Hyperlink"/>
@@ -17822,7 +17852,7 @@
             <w:pPr>
               <w:spacing w:after="0" w:line="252"/>
             </w:pPr>
-            <w:hyperlink w:history="1" r:id="rIduwqkmpmccs4gfhvvb2s_u">
+            <w:hyperlink w:history="1" r:id="rIdksn4yxpzpinmzj5w4643t">
               <w:r>
                 <w:rPr>
                   <w:rStyle w:val="Hyperlink"/>
@@ -17855,7 +17885,7 @@
             <w:pPr>
               <w:spacing w:after="0" w:line="252"/>
             </w:pPr>
-            <w:hyperlink w:history="1" r:id="rId0highomgbjo_mour714jv">
+            <w:hyperlink w:history="1" r:id="rIdjrgljxzrboap7pbnzzavn">
               <w:r>
                 <w:rPr>
                   <w:rStyle w:val="Hyperlink"/>

</xml_diff>

<commit_message>
Monchau figures: window 1 Jun - 27 Oct 2026 in all three current reports
Counts run 1 Jun - 17 Sep (index end, 1,244 posts; 328 tech narrow, 363 broad, 481-514 wide); 18 Sep - 27 Oct covered by the live sample.

Co-Authored-By: Claude Opus 5.5 <noreply@anthropic.com>
Claude-Session: https://claude.ai/code/session_014bN7rQcP2nbYZw3SVHbi7t
</commit_message>
<xml_diff>
--- a/reports/ai-voices-linkedin-2026-10-28/AI_Voices_LinkedIn_Analysis.docx
+++ b/reports/ai-voices-linkedin-2026-10-28/AI_Voices_LinkedIn_Analysis.docx
@@ -272,7 +272,7 @@
           <w:sz w:val="20"/>
           <w:szCs w:val="20"/>
         </w:rPr>
-        <w:t xml:space="preserve">Measured with the same broad keyword set, 295 of his 1,051 posts match (28%, against 26% narrow): almost every "model", "GPT" or "compute" post of his already says "AI" or "tech". The big jumps are confined to product-led writers such as Nadella (38% → 88%) and Srinivas (15% → 85%).</w:t>
+        <w:t xml:space="preserve">On his 1 Jun – 27 Oct window (counts to 17 Sep, 1,244 posts), the same broad keyword set matches 363 posts (29%, against 26% narrow): almost every "model", "GPT" or "compute" post of his already says "AI" or "tech". The big jumps are confined to product-led writers such as Nadella (38% → 88%) and Srinivas (15% → 85%). With a wide net of tech names and themes (big tech, chips, cloud, Musk, Nasdaq), about 39–41% of Monchau's posts are tech-related.</w:t>
       </w:r>
     </w:p>
     <w:p>
@@ -1343,7 +1343,7 @@
             <w:pPr>
               <w:spacing w:after="0" w:line="252"/>
             </w:pPr>
-            <w:hyperlink w:history="1" r:id="rIdfegtgszgqxp2bxv7hhtcj">
+            <w:hyperlink w:history="1" r:id="rIdqeb0kyqnmrped-psipi39">
               <w:r>
                 <w:rPr>
                   <w:rStyle w:val="Hyperlink"/>
@@ -1669,7 +1669,7 @@
             <w:pPr>
               <w:spacing w:after="0" w:line="252"/>
             </w:pPr>
-            <w:hyperlink w:history="1" r:id="rIdwxkf1fazlqqo7tpnyecf6">
+            <w:hyperlink w:history="1" r:id="rIdsveolmhgk3lauefnj388v">
               <w:r>
                 <w:rPr>
                   <w:rStyle w:val="Hyperlink"/>
@@ -1995,7 +1995,7 @@
             <w:pPr>
               <w:spacing w:after="0" w:line="252"/>
             </w:pPr>
-            <w:hyperlink w:history="1" r:id="rIdhpgomzpx_haka-xbgr1by">
+            <w:hyperlink w:history="1" r:id="rIdbnapdzrhpd8rhvzq_sdlv">
               <w:r>
                 <w:rPr>
                   <w:rStyle w:val="Hyperlink"/>
@@ -2321,7 +2321,7 @@
             <w:pPr>
               <w:spacing w:after="0" w:line="252"/>
             </w:pPr>
-            <w:hyperlink w:history="1" r:id="rIdulx7l13mvwwnjkxzqonho">
+            <w:hyperlink w:history="1" r:id="rIdhipyhtqzcdpim-kzvfwzh">
               <w:r>
                 <w:rPr>
                   <w:rStyle w:val="Hyperlink"/>
@@ -2647,7 +2647,7 @@
             <w:pPr>
               <w:spacing w:after="0" w:line="252"/>
             </w:pPr>
-            <w:hyperlink w:history="1" r:id="rId4zbbhqgyt1mp4b0hkzfv2">
+            <w:hyperlink w:history="1" r:id="rId69pqlruajy87jgdicg622">
               <w:r>
                 <w:rPr>
                   <w:rStyle w:val="Hyperlink"/>
@@ -2973,7 +2973,7 @@
             <w:pPr>
               <w:spacing w:after="0" w:line="252"/>
             </w:pPr>
-            <w:hyperlink w:history="1" r:id="rId8otjv__mfa57_bmdx3ldz">
+            <w:hyperlink w:history="1" r:id="rIdh-th0vmj-qixo-7_zfscn">
               <w:r>
                 <w:rPr>
                   <w:rStyle w:val="Hyperlink"/>
@@ -3299,7 +3299,7 @@
             <w:pPr>
               <w:spacing w:after="0" w:line="252"/>
             </w:pPr>
-            <w:hyperlink w:history="1" r:id="rId9_xbmjduvo34dgzpcuzwl">
+            <w:hyperlink w:history="1" r:id="rIdurhsutmvkiymhufe6s2hy">
               <w:r>
                 <w:rPr>
                   <w:rStyle w:val="Hyperlink"/>
@@ -3327,7 +3327,7 @@
           <w:sz w:val="16"/>
           <w:szCs w:val="16"/>
         </w:rPr>
-        <w:t xml:space="preserve">Monchau benchmark: 1,051 posts, 80.8 a week, 271 tech (26%; 295 or 28% with the broad keywords), 86% credit a source.</w:t>
+        <w:t xml:space="preserve">Monchau benchmark, 1 Jun – 27 Oct 2026 (counts to the index end, 17 Sep): 1,244 posts, 80.6 a week, 328 tech (26%; 363 or 29% with the broad keywords; 39–41% with a wide tech net), 86% credit a source.</w:t>
       </w:r>
     </w:p>
     <w:p>
@@ -7327,7 +7327,7 @@
             <w:pPr>
               <w:spacing w:after="0" w:line="252"/>
             </w:pPr>
-            <w:hyperlink w:history="1" r:id="rIdnvv51_cuipvanymaorlvg">
+            <w:hyperlink w:history="1" r:id="rIdfh9izxcyate6vhqvclbfe">
               <w:r>
                 <w:rPr>
                   <w:rStyle w:val="Hyperlink"/>
@@ -7554,7 +7554,7 @@
             <w:pPr>
               <w:spacing w:after="0" w:line="252"/>
             </w:pPr>
-            <w:hyperlink w:history="1" r:id="rIdhw2in-87owelhoxardzib">
+            <w:hyperlink w:history="1" r:id="rIdr9-o00xrsqrg_qzd5uose">
               <w:r>
                 <w:rPr>
                   <w:rStyle w:val="Hyperlink"/>
@@ -7781,7 +7781,7 @@
             <w:pPr>
               <w:spacing w:after="0" w:line="252"/>
             </w:pPr>
-            <w:hyperlink w:history="1" r:id="rId_9nq4afcqfg8rmfolkcob">
+            <w:hyperlink w:history="1" r:id="rId3k3qxlw5gcadwmlqwfp60">
               <w:r>
                 <w:rPr>
                   <w:rStyle w:val="Hyperlink"/>
@@ -8360,7 +8360,7 @@
             <w:pPr>
               <w:spacing w:after="0" w:line="252"/>
             </w:pPr>
-            <w:hyperlink w:history="1" r:id="rId6kbzcn351cqdmxj4czazv">
+            <w:hyperlink w:history="1" r:id="rIdfzr_xdi6ad6wdsifigdqo">
               <w:r>
                 <w:rPr>
                   <w:rStyle w:val="Hyperlink"/>
@@ -8587,7 +8587,7 @@
             <w:pPr>
               <w:spacing w:after="0" w:line="252"/>
             </w:pPr>
-            <w:hyperlink w:history="1" r:id="rIdpdyef8-a_dpe6v8vfnc0g">
+            <w:hyperlink w:history="1" r:id="rIdfgax6nsaf-j5s2nktksbw">
               <w:r>
                 <w:rPr>
                   <w:rStyle w:val="Hyperlink"/>
@@ -8814,7 +8814,7 @@
             <w:pPr>
               <w:spacing w:after="0" w:line="252"/>
             </w:pPr>
-            <w:hyperlink w:history="1" r:id="rIdtkayiqhlebozxtqqgu6zz">
+            <w:hyperlink w:history="1" r:id="rIdzg0see4djb-lv3ky4hzy3">
               <w:r>
                 <w:rPr>
                   <w:rStyle w:val="Hyperlink"/>
@@ -9393,7 +9393,7 @@
             <w:pPr>
               <w:spacing w:after="0" w:line="252"/>
             </w:pPr>
-            <w:hyperlink w:history="1" r:id="rId0ci1ncytvysgq0z_rlani">
+            <w:hyperlink w:history="1" r:id="rId_1qgt3x-kit8y_5xzb13b">
               <w:r>
                 <w:rPr>
                   <w:rStyle w:val="Hyperlink"/>
@@ -9620,7 +9620,7 @@
             <w:pPr>
               <w:spacing w:after="0" w:line="252"/>
             </w:pPr>
-            <w:hyperlink w:history="1" r:id="rIdqgnsbui_dnmcqneiovywi">
+            <w:hyperlink w:history="1" r:id="rIdz24n8cmpikaknick17be0">
               <w:r>
                 <w:rPr>
                   <w:rStyle w:val="Hyperlink"/>
@@ -9847,7 +9847,7 @@
             <w:pPr>
               <w:spacing w:after="0" w:line="252"/>
             </w:pPr>
-            <w:hyperlink w:history="1" r:id="rIditwkwkc6ykjmq9qkugf5e">
+            <w:hyperlink w:history="1" r:id="rId3k9vc67o_usztvlpxtlv3">
               <w:r>
                 <w:rPr>
                   <w:rStyle w:val="Hyperlink"/>
@@ -10426,7 +10426,7 @@
             <w:pPr>
               <w:spacing w:after="0" w:line="252"/>
             </w:pPr>
-            <w:hyperlink w:history="1" r:id="rIdiblwzycjizceodb7x-ftn">
+            <w:hyperlink w:history="1" r:id="rIdt25l0eccqzzmhwd8lkoxt">
               <w:r>
                 <w:rPr>
                   <w:rStyle w:val="Hyperlink"/>
@@ -10653,7 +10653,7 @@
             <w:pPr>
               <w:spacing w:after="0" w:line="252"/>
             </w:pPr>
-            <w:hyperlink w:history="1" r:id="rIdzbs94dtbt_1bdfxzvdt1w">
+            <w:hyperlink w:history="1" r:id="rIdggjdrmggnegzp8ppxewss">
               <w:r>
                 <w:rPr>
                   <w:rStyle w:val="Hyperlink"/>
@@ -10880,7 +10880,7 @@
             <w:pPr>
               <w:spacing w:after="0" w:line="252"/>
             </w:pPr>
-            <w:hyperlink w:history="1" r:id="rId8yfzawb7eopf84xwf6osb">
+            <w:hyperlink w:history="1" r:id="rIdcttsacalogpczkbtlljmj">
               <w:r>
                 <w:rPr>
                   <w:rStyle w:val="Hyperlink"/>
@@ -11459,7 +11459,7 @@
             <w:pPr>
               <w:spacing w:after="0" w:line="252"/>
             </w:pPr>
-            <w:hyperlink w:history="1" r:id="rIddcmoh5it62a-xsirx0ocx">
+            <w:hyperlink w:history="1" r:id="rIdxmmr-i2ybzlij2uxl54ks">
               <w:r>
                 <w:rPr>
                   <w:rStyle w:val="Hyperlink"/>
@@ -11686,7 +11686,7 @@
             <w:pPr>
               <w:spacing w:after="0" w:line="252"/>
             </w:pPr>
-            <w:hyperlink w:history="1" r:id="rIdp5a3qsve-tibs1yia9eik">
+            <w:hyperlink w:history="1" r:id="rIdc7jfcwnwf4kmv4hvndwee">
               <w:r>
                 <w:rPr>
                   <w:rStyle w:val="Hyperlink"/>
@@ -11913,7 +11913,7 @@
             <w:pPr>
               <w:spacing w:after="0" w:line="252"/>
             </w:pPr>
-            <w:hyperlink w:history="1" r:id="rIdbjk1n4qqkxzfxek6a09jt">
+            <w:hyperlink w:history="1" r:id="rIdk1jzc66zkvyhuu0f8omsw">
               <w:r>
                 <w:rPr>
                   <w:rStyle w:val="Hyperlink"/>
@@ -12492,7 +12492,7 @@
             <w:pPr>
               <w:spacing w:after="0" w:line="252"/>
             </w:pPr>
-            <w:hyperlink w:history="1" r:id="rIdl6agkm9qpxc92l8v6p1av">
+            <w:hyperlink w:history="1" r:id="rIdwafts6wq7eqtk9smntxew">
               <w:r>
                 <w:rPr>
                   <w:rStyle w:val="Hyperlink"/>
@@ -12719,7 +12719,7 @@
             <w:pPr>
               <w:spacing w:after="0" w:line="252"/>
             </w:pPr>
-            <w:hyperlink w:history="1" r:id="rIdvo-zxjjg1_pupiokggzua">
+            <w:hyperlink w:history="1" r:id="rId7dkl2iaew7zs7nqthzvmi">
               <w:r>
                 <w:rPr>
                   <w:rStyle w:val="Hyperlink"/>
@@ -12946,7 +12946,7 @@
             <w:pPr>
               <w:spacing w:after="0" w:line="252"/>
             </w:pPr>
-            <w:hyperlink w:history="1" r:id="rIdd5ae48gwcjuls7xl4vbur">
+            <w:hyperlink w:history="1" r:id="rIdie1fajxqqidpe7owlswdp">
               <w:r>
                 <w:rPr>
                   <w:rStyle w:val="Hyperlink"/>
@@ -13525,7 +13525,7 @@
             <w:pPr>
               <w:spacing w:after="0" w:line="252"/>
             </w:pPr>
-            <w:hyperlink w:history="1" r:id="rIdxsp4ulhxyvx0avfy5rrjm">
+            <w:hyperlink w:history="1" r:id="rIdnbar38alzqp5soqzazgcl">
               <w:r>
                 <w:rPr>
                   <w:rStyle w:val="Hyperlink"/>
@@ -13752,7 +13752,7 @@
             <w:pPr>
               <w:spacing w:after="0" w:line="252"/>
             </w:pPr>
-            <w:hyperlink w:history="1" r:id="rId4ccdyjly_s0i8u-43qbop">
+            <w:hyperlink w:history="1" r:id="rId3rflec8umhsmesr3oouim">
               <w:r>
                 <w:rPr>
                   <w:rStyle w:val="Hyperlink"/>
@@ -13979,7 +13979,7 @@
             <w:pPr>
               <w:spacing w:after="0" w:line="252"/>
             </w:pPr>
-            <w:hyperlink w:history="1" r:id="rIdcfmv5uryybdpnhs173km4">
+            <w:hyperlink w:history="1" r:id="rIdv3s7wwn1c2oeqahiqana-">
               <w:r>
                 <w:rPr>
                   <w:rStyle w:val="Hyperlink"/>
@@ -14629,7 +14629,7 @@
             <w:pPr>
               <w:spacing w:after="0" w:line="252"/>
             </w:pPr>
-            <w:hyperlink w:history="1" r:id="rIdfwzuogzly7vsz1bi71k-d">
+            <w:hyperlink w:history="1" r:id="rIduqjynqzbexbjrdhkk0jv9">
               <w:r>
                 <w:rPr>
                   <w:rStyle w:val="Hyperlink"/>
@@ -14662,7 +14662,7 @@
             <w:pPr>
               <w:spacing w:after="0" w:line="252"/>
             </w:pPr>
-            <w:hyperlink w:history="1" r:id="rIdxxsjdin-s3twyfz_oibch">
+            <w:hyperlink w:history="1" r:id="rIddwxmwtoldzxdjcaqqacuo">
               <w:r>
                 <w:rPr>
                   <w:rStyle w:val="Hyperlink"/>
@@ -14922,7 +14922,7 @@
             <w:pPr>
               <w:spacing w:after="0" w:line="252"/>
             </w:pPr>
-            <w:hyperlink w:history="1" r:id="rIddwwnnodaqcnijvvpwklag">
+            <w:hyperlink w:history="1" r:id="rIdsjwniaka8r5wybvogrngw">
               <w:r>
                 <w:rPr>
                   <w:rStyle w:val="Hyperlink"/>
@@ -14955,7 +14955,7 @@
             <w:pPr>
               <w:spacing w:after="0" w:line="252"/>
             </w:pPr>
-            <w:hyperlink w:history="1" r:id="rIdrtylywxoqmmq_5ggrxkq1">
+            <w:hyperlink w:history="1" r:id="rId-rdm7gygt5iby7i01rb4s">
               <w:r>
                 <w:rPr>
                   <w:rStyle w:val="Hyperlink"/>
@@ -15215,7 +15215,7 @@
             <w:pPr>
               <w:spacing w:after="0" w:line="252"/>
             </w:pPr>
-            <w:hyperlink w:history="1" r:id="rIdtzzkkgisvg4se4c85huma">
+            <w:hyperlink w:history="1" r:id="rIddizysdntm5yaztklxbeit">
               <w:r>
                 <w:rPr>
                   <w:rStyle w:val="Hyperlink"/>
@@ -15248,7 +15248,7 @@
             <w:pPr>
               <w:spacing w:after="0" w:line="252"/>
             </w:pPr>
-            <w:hyperlink w:history="1" r:id="rIdzr2exw-2vthmndqlpvods">
+            <w:hyperlink w:history="1" r:id="rId32qnusulfl7fbquojv0t3">
               <w:r>
                 <w:rPr>
                   <w:rStyle w:val="Hyperlink"/>
@@ -15508,7 +15508,7 @@
             <w:pPr>
               <w:spacing w:after="0" w:line="252"/>
             </w:pPr>
-            <w:hyperlink w:history="1" r:id="rIdjbmbdmjjpqrk-fe1wyuhk">
+            <w:hyperlink w:history="1" r:id="rIdluaixwt3quuwsfyb5gmjn">
               <w:r>
                 <w:rPr>
                   <w:rStyle w:val="Hyperlink"/>
@@ -15541,7 +15541,7 @@
             <w:pPr>
               <w:spacing w:after="0" w:line="252"/>
             </w:pPr>
-            <w:hyperlink w:history="1" r:id="rIdmw8ijj-ezjzr102zw42xk">
+            <w:hyperlink w:history="1" r:id="rIdi-metlnypoolatslomgrg">
               <w:r>
                 <w:rPr>
                   <w:rStyle w:val="Hyperlink"/>
@@ -15801,7 +15801,7 @@
             <w:pPr>
               <w:spacing w:after="0" w:line="252"/>
             </w:pPr>
-            <w:hyperlink w:history="1" r:id="rIdo4i4z7z2ahpeohteglgy9">
+            <w:hyperlink w:history="1" r:id="rIdwvht4dmtys0o8-wii6mdv">
               <w:r>
                 <w:rPr>
                   <w:rStyle w:val="Hyperlink"/>
@@ -15834,7 +15834,7 @@
             <w:pPr>
               <w:spacing w:after="0" w:line="252"/>
             </w:pPr>
-            <w:hyperlink w:history="1" r:id="rIdmuw1sahsgaz7hiy5k5fwe">
+            <w:hyperlink w:history="1" r:id="rIdwl5kv2o-dryawhg1tz7p3">
               <w:r>
                 <w:rPr>
                   <w:rStyle w:val="Hyperlink"/>
@@ -16094,7 +16094,7 @@
             <w:pPr>
               <w:spacing w:after="0" w:line="252"/>
             </w:pPr>
-            <w:hyperlink w:history="1" r:id="rIdskgbgn2lufoa8gv2flcqc">
+            <w:hyperlink w:history="1" r:id="rIdf-zefr9lygbjyto1vwp8z">
               <w:r>
                 <w:rPr>
                   <w:rStyle w:val="Hyperlink"/>
@@ -16127,7 +16127,7 @@
             <w:pPr>
               <w:spacing w:after="0" w:line="252"/>
             </w:pPr>
-            <w:hyperlink w:history="1" r:id="rIdmqclcga-ojfpg3p-o2ver">
+            <w:hyperlink w:history="1" r:id="rId93ektjdb3oveztn0ivzlg">
               <w:r>
                 <w:rPr>
                   <w:rStyle w:val="Hyperlink"/>
@@ -16387,7 +16387,7 @@
             <w:pPr>
               <w:spacing w:after="0" w:line="252"/>
             </w:pPr>
-            <w:hyperlink w:history="1" r:id="rIdmmhrda8jnttrz885rzmej">
+            <w:hyperlink w:history="1" r:id="rId_ccgibzbfbc8meizwn7w9">
               <w:r>
                 <w:rPr>
                   <w:rStyle w:val="Hyperlink"/>
@@ -16420,7 +16420,7 @@
             <w:pPr>
               <w:spacing w:after="0" w:line="252"/>
             </w:pPr>
-            <w:hyperlink w:history="1" r:id="rIdiaponab2k90dmwtdj0fd3">
+            <w:hyperlink w:history="1" r:id="rId4z2az5qh2f0ioer83anwd">
               <w:r>
                 <w:rPr>
                   <w:rStyle w:val="Hyperlink"/>
@@ -16680,7 +16680,7 @@
             <w:pPr>
               <w:spacing w:after="0" w:line="252"/>
             </w:pPr>
-            <w:hyperlink w:history="1" r:id="rId-wseeyqqtceyiyhezkomt">
+            <w:hyperlink w:history="1" r:id="rIdcwep_fk2bhwlg__j4lpj-">
               <w:r>
                 <w:rPr>
                   <w:rStyle w:val="Hyperlink"/>
@@ -16713,7 +16713,7 @@
             <w:pPr>
               <w:spacing w:after="0" w:line="252"/>
             </w:pPr>
-            <w:hyperlink w:history="1" r:id="rIdcym0ienn07hre2dzxbvzy">
+            <w:hyperlink w:history="1" r:id="rIdekplqamzzrxwmrsroyavx">
               <w:r>
                 <w:rPr>
                   <w:rStyle w:val="Hyperlink"/>
@@ -16973,7 +16973,7 @@
             <w:pPr>
               <w:spacing w:after="0" w:line="252"/>
             </w:pPr>
-            <w:hyperlink w:history="1" r:id="rIdwpotdhj0vuqkdfb1ugibk">
+            <w:hyperlink w:history="1" r:id="rId7jpsf23sjnk_wih6wriuj">
               <w:r>
                 <w:rPr>
                   <w:rStyle w:val="Hyperlink"/>
@@ -17006,7 +17006,7 @@
             <w:pPr>
               <w:spacing w:after="0" w:line="252"/>
             </w:pPr>
-            <w:hyperlink w:history="1" r:id="rIdgka4jpftbox8nx7ltkma0">
+            <w:hyperlink w:history="1" r:id="rId8xdqvh5aeht-eubt2d1o1">
               <w:r>
                 <w:rPr>
                   <w:rStyle w:val="Hyperlink"/>
@@ -17266,7 +17266,7 @@
             <w:pPr>
               <w:spacing w:after="0" w:line="252"/>
             </w:pPr>
-            <w:hyperlink w:history="1" r:id="rIdcnpsprrov7abhw0hy3jaz">
+            <w:hyperlink w:history="1" r:id="rIdhjga8lmgtao3nblwmtfuc">
               <w:r>
                 <w:rPr>
                   <w:rStyle w:val="Hyperlink"/>
@@ -17299,7 +17299,7 @@
             <w:pPr>
               <w:spacing w:after="0" w:line="252"/>
             </w:pPr>
-            <w:hyperlink w:history="1" r:id="rId_vbil5jasufwsxh-lnpye">
+            <w:hyperlink w:history="1" r:id="rIdr1v68fabm1zm7vtgvkzof">
               <w:r>
                 <w:rPr>
                   <w:rStyle w:val="Hyperlink"/>
@@ -17559,7 +17559,7 @@
             <w:pPr>
               <w:spacing w:after="0" w:line="252"/>
             </w:pPr>
-            <w:hyperlink w:history="1" r:id="rIduukhgfd3sl9zswu8azwc5">
+            <w:hyperlink w:history="1" r:id="rIdy_wia7mhwwhconlte1gz2">
               <w:r>
                 <w:rPr>
                   <w:rStyle w:val="Hyperlink"/>
@@ -17592,7 +17592,7 @@
             <w:pPr>
               <w:spacing w:after="0" w:line="252"/>
             </w:pPr>
-            <w:hyperlink w:history="1" r:id="rIdwmnaxaco6tg6zq7yb40le">
+            <w:hyperlink w:history="1" r:id="rIdd1twxb5j8pinduba3wzmy">
               <w:r>
                 <w:rPr>
                   <w:rStyle w:val="Hyperlink"/>
@@ -17852,7 +17852,7 @@
             <w:pPr>
               <w:spacing w:after="0" w:line="252"/>
             </w:pPr>
-            <w:hyperlink w:history="1" r:id="rIdksn4yxpzpinmzj5w4643t">
+            <w:hyperlink w:history="1" r:id="rIdeyivyrdvkkixshjtew1uc">
               <w:r>
                 <w:rPr>
                   <w:rStyle w:val="Hyperlink"/>
@@ -17885,7 +17885,7 @@
             <w:pPr>
               <w:spacing w:after="0" w:line="252"/>
             </w:pPr>
-            <w:hyperlink w:history="1" r:id="rIdjrgljxzrboap7pbnzzavn">
+            <w:hyperlink w:history="1" r:id="rId8zcrvvdd83ukd4phvi_jw">
               <w:r>
                 <w:rPr>
                   <w:rStyle w:val="Hyperlink"/>

</xml_diff>